<commit_message>
feat(legacy-import): analysis complete from GeneXus KB GLPPortal
</commit_message>
<xml_diff>
--- a/docs/legacy-import/01-analise-completa.docx
+++ b/docs/legacy-import/01-analise-completa.docx
@@ -382,14 +382,14 @@
         <w:tc>
           <w:p>
             <w:r>
-              <w:t>UNKNOWN(1132ac08)</w:t>
-            </w:r>
-          </w:p>
-        </w:tc>
-        <w:tc>
-          <w:p>
-            <w:r>
-              <w:t>37</w:t>
+              <w:t>UNKNOWN(083f1b21)</w:t>
+            </w:r>
+          </w:p>
+        </w:tc>
+        <w:tc>
+          <w:p>
+            <w:r>
+              <w:t>82</w:t>
             </w:r>
           </w:p>
         </w:tc>
@@ -398,14 +398,14 @@
         <w:tc>
           <w:p>
             <w:r>
-              <w:t>UNKNOWN(3affc0b3)</w:t>
-            </w:r>
-          </w:p>
-        </w:tc>
-        <w:tc>
-          <w:p>
-            <w:r>
-              <w:t>4</w:t>
+              <w:t>UNKNOWN(78b3fa0e)</w:t>
+            </w:r>
+          </w:p>
+        </w:tc>
+        <w:tc>
+          <w:p>
+            <w:r>
+              <w:t>10</w:t>
             </w:r>
           </w:p>
         </w:tc>
@@ -414,14 +414,14 @@
         <w:tc>
           <w:p>
             <w:r>
-              <w:t>UNKNOWN(36e32e2d)</w:t>
-            </w:r>
-          </w:p>
-        </w:tc>
-        <w:tc>
-          <w:p>
-            <w:r>
-              <w:t>1</w:t>
+              <w:t>UNKNOWN(2a9e9aba)</w:t>
+            </w:r>
+          </w:p>
+        </w:tc>
+        <w:tc>
+          <w:p>
+            <w:r>
+              <w:t>21</w:t>
             </w:r>
           </w:p>
         </w:tc>
@@ -430,14 +430,14 @@
         <w:tc>
           <w:p>
             <w:r>
-              <w:t>UNKNOWN(78cecefe)</w:t>
-            </w:r>
-          </w:p>
-        </w:tc>
-        <w:tc>
-          <w:p>
-            <w:r>
-              <w:t>6</w:t>
+              <w:t>UNKNOWN(bf08dfb1)</w:t>
+            </w:r>
+          </w:p>
+        </w:tc>
+        <w:tc>
+          <w:p>
+            <w:r>
+              <w:t>2</w:t>
             </w:r>
           </w:p>
         </w:tc>
@@ -446,14 +446,14 @@
         <w:tc>
           <w:p>
             <w:r>
-              <w:t>UNKNOWN(c804fdbd)</w:t>
-            </w:r>
-          </w:p>
-        </w:tc>
-        <w:tc>
-          <w:p>
-            <w:r>
-              <w:t>7</w:t>
+              <w:t>UNKNOWN(ffd44be7)</w:t>
+            </w:r>
+          </w:p>
+        </w:tc>
+        <w:tc>
+          <w:p>
+            <w:r>
+              <w:t>78</w:t>
             </w:r>
           </w:p>
         </w:tc>
@@ -462,14 +462,14 @@
         <w:tc>
           <w:p>
             <w:r>
-              <w:t>UNKNOWN(c88fffcd)</w:t>
-            </w:r>
-          </w:p>
-        </w:tc>
-        <w:tc>
-          <w:p>
-            <w:r>
-              <w:t>51</w:t>
+              <w:t>UNKNOWN(624a8b31)</w:t>
+            </w:r>
+          </w:p>
+        </w:tc>
+        <w:tc>
+          <w:p>
+            <w:r>
+              <w:t>4</w:t>
             </w:r>
           </w:p>
         </w:tc>
@@ -478,14 +478,14 @@
         <w:tc>
           <w:p>
             <w:r>
-              <w:t>UNKNOWN(83476c1e)</w:t>
-            </w:r>
-          </w:p>
-        </w:tc>
-        <w:tc>
-          <w:p>
-            <w:r>
-              <w:t>3</w:t>
+              <w:t>UNKNOWN(ecececec)</w:t>
+            </w:r>
+          </w:p>
+        </w:tc>
+        <w:tc>
+          <w:p>
+            <w:r>
+              <w:t>4</w:t>
             </w:r>
           </w:p>
         </w:tc>
@@ -494,14 +494,14 @@
         <w:tc>
           <w:p>
             <w:r>
-              <w:t>UNKNOWN(562f4793)</w:t>
-            </w:r>
-          </w:p>
-        </w:tc>
-        <w:tc>
-          <w:p>
-            <w:r>
-              <w:t>21</w:t>
+              <w:t>UNKNOWN(faeb588c)</w:t>
+            </w:r>
+          </w:p>
+        </w:tc>
+        <w:tc>
+          <w:p>
+            <w:r>
+              <w:t>1</w:t>
             </w:r>
           </w:p>
         </w:tc>
@@ -510,14 +510,14 @@
         <w:tc>
           <w:p>
             <w:r>
-              <w:t>UNKNOWN(dcdcdcdc)</w:t>
-            </w:r>
-          </w:p>
-        </w:tc>
-        <w:tc>
-          <w:p>
-            <w:r>
-              <w:t>3</w:t>
+              <w:t>UNKNOWN(19abc6ff)</w:t>
+            </w:r>
+          </w:p>
+        </w:tc>
+        <w:tc>
+          <w:p>
+            <w:r>
+              <w:t>21</w:t>
             </w:r>
           </w:p>
         </w:tc>
@@ -526,14 +526,14 @@
         <w:tc>
           <w:p>
             <w:r>
-              <w:t>UNKNOWN(88313f43)</w:t>
-            </w:r>
-          </w:p>
-        </w:tc>
-        <w:tc>
-          <w:p>
-            <w:r>
-              <w:t>3</w:t>
+              <w:t>UNKNOWN(5592de59)</w:t>
+            </w:r>
+          </w:p>
+        </w:tc>
+        <w:tc>
+          <w:p>
+            <w:r>
+              <w:t>135</w:t>
             </w:r>
           </w:p>
         </w:tc>
@@ -542,14 +542,14 @@
         <w:tc>
           <w:p>
             <w:r>
-              <w:t>UNKNOWN(5592de59)</w:t>
-            </w:r>
-          </w:p>
-        </w:tc>
-        <w:tc>
-          <w:p>
-            <w:r>
-              <w:t>135</w:t>
+              <w:t>UNKNOWN(88313f43)</w:t>
+            </w:r>
+          </w:p>
+        </w:tc>
+        <w:tc>
+          <w:p>
+            <w:r>
+              <w:t>3</w:t>
             </w:r>
           </w:p>
         </w:tc>
@@ -558,14 +558,14 @@
         <w:tc>
           <w:p>
             <w:r>
-              <w:t>UNKNOWN(19abc6ff)</w:t>
-            </w:r>
-          </w:p>
-        </w:tc>
-        <w:tc>
-          <w:p>
-            <w:r>
-              <w:t>21</w:t>
+              <w:t>UNKNOWN(dcdcdcdc)</w:t>
+            </w:r>
+          </w:p>
+        </w:tc>
+        <w:tc>
+          <w:p>
+            <w:r>
+              <w:t>3</w:t>
             </w:r>
           </w:p>
         </w:tc>
@@ -574,14 +574,14 @@
         <w:tc>
           <w:p>
             <w:r>
-              <w:t>UNKNOWN(faeb588c)</w:t>
-            </w:r>
-          </w:p>
-        </w:tc>
-        <w:tc>
-          <w:p>
-            <w:r>
-              <w:t>1</w:t>
+              <w:t>UNKNOWN(562f4793)</w:t>
+            </w:r>
+          </w:p>
+        </w:tc>
+        <w:tc>
+          <w:p>
+            <w:r>
+              <w:t>21</w:t>
             </w:r>
           </w:p>
         </w:tc>
@@ -590,14 +590,14 @@
         <w:tc>
           <w:p>
             <w:r>
-              <w:t>UNKNOWN(ecececec)</w:t>
-            </w:r>
-          </w:p>
-        </w:tc>
-        <w:tc>
-          <w:p>
-            <w:r>
-              <w:t>4</w:t>
+              <w:t>UNKNOWN(83476c1e)</w:t>
+            </w:r>
+          </w:p>
+        </w:tc>
+        <w:tc>
+          <w:p>
+            <w:r>
+              <w:t>3</w:t>
             </w:r>
           </w:p>
         </w:tc>
@@ -606,14 +606,14 @@
         <w:tc>
           <w:p>
             <w:r>
-              <w:t>UNKNOWN(624a8b31)</w:t>
-            </w:r>
-          </w:p>
-        </w:tc>
-        <w:tc>
-          <w:p>
-            <w:r>
-              <w:t>4</w:t>
+              <w:t>UNKNOWN(c88fffcd)</w:t>
+            </w:r>
+          </w:p>
+        </w:tc>
+        <w:tc>
+          <w:p>
+            <w:r>
+              <w:t>51</w:t>
             </w:r>
           </w:p>
         </w:tc>
@@ -622,14 +622,14 @@
         <w:tc>
           <w:p>
             <w:r>
-              <w:t>UNKNOWN(ffd44be7)</w:t>
-            </w:r>
-          </w:p>
-        </w:tc>
-        <w:tc>
-          <w:p>
-            <w:r>
-              <w:t>78</w:t>
+              <w:t>UNKNOWN(c804fdbd)</w:t>
+            </w:r>
+          </w:p>
+        </w:tc>
+        <w:tc>
+          <w:p>
+            <w:r>
+              <w:t>7</w:t>
             </w:r>
           </w:p>
         </w:tc>
@@ -638,14 +638,14 @@
         <w:tc>
           <w:p>
             <w:r>
-              <w:t>UNKNOWN(bf08dfb1)</w:t>
-            </w:r>
-          </w:p>
-        </w:tc>
-        <w:tc>
-          <w:p>
-            <w:r>
-              <w:t>2</w:t>
+              <w:t>UNKNOWN(78cecefe)</w:t>
+            </w:r>
+          </w:p>
+        </w:tc>
+        <w:tc>
+          <w:p>
+            <w:r>
+              <w:t>6</w:t>
             </w:r>
           </w:p>
         </w:tc>
@@ -654,14 +654,14 @@
         <w:tc>
           <w:p>
             <w:r>
-              <w:t>UNKNOWN(2a9e9aba)</w:t>
-            </w:r>
-          </w:p>
-        </w:tc>
-        <w:tc>
-          <w:p>
-            <w:r>
-              <w:t>21</w:t>
+              <w:t>UNKNOWN(36e32e2d)</w:t>
+            </w:r>
+          </w:p>
+        </w:tc>
+        <w:tc>
+          <w:p>
+            <w:r>
+              <w:t>1</w:t>
             </w:r>
           </w:p>
         </w:tc>
@@ -670,14 +670,14 @@
         <w:tc>
           <w:p>
             <w:r>
-              <w:t>UNKNOWN(78b3fa0e)</w:t>
-            </w:r>
-          </w:p>
-        </w:tc>
-        <w:tc>
-          <w:p>
-            <w:r>
-              <w:t>10</w:t>
+              <w:t>UNKNOWN(3affc0b3)</w:t>
+            </w:r>
+          </w:p>
+        </w:tc>
+        <w:tc>
+          <w:p>
+            <w:r>
+              <w:t>4</w:t>
             </w:r>
           </w:p>
         </w:tc>
@@ -686,14 +686,14 @@
         <w:tc>
           <w:p>
             <w:r>
-              <w:t>UNKNOWN(083f1b21)</w:t>
-            </w:r>
-          </w:p>
-        </w:tc>
-        <w:tc>
-          <w:p>
-            <w:r>
-              <w:t>82</w:t>
+              <w:t>UNKNOWN(1132ac08)</w:t>
+            </w:r>
+          </w:p>
+        </w:tc>
+        <w:tc>
+          <w:p>
+            <w:r>
+              <w:t>37</w:t>
             </w:r>
           </w:p>
         </w:tc>
@@ -4959,358 +4959,358 @@
         <w:rPr>
           <w:sz w:val="22"/>
         </w:rPr>
-        <w:t>• WorkWithPlusAcessoCliente — version=1.3, pattern=07135890</w:t>
-        <w:br/>
-      </w:r>
-    </w:p>
-    <w:p>
-      <w:r>
-        <w:rPr>
-          <w:sz w:val="22"/>
-        </w:rPr>
-        <w:t>• WorkWithPlusAddressDisplay — version=1.3, pattern=07135890</w:t>
-        <w:br/>
-      </w:r>
-    </w:p>
-    <w:p>
-      <w:r>
-        <w:rPr>
-          <w:sz w:val="22"/>
-        </w:rPr>
-        <w:t>• WorkWithPlusExportOptions — version=1.3, pattern=07135890</w:t>
-        <w:br/>
-      </w:r>
-    </w:p>
-    <w:p>
-      <w:r>
-        <w:rPr>
-          <w:sz w:val="22"/>
-        </w:rPr>
-        <w:t>• WorkWithPlusHome — version=1.3, pattern=07135890</w:t>
-        <w:br/>
-      </w:r>
-    </w:p>
-    <w:p>
-      <w:r>
-        <w:rPr>
-          <w:sz w:val="22"/>
-        </w:rPr>
-        <w:t>• WorkWithPlusManageFilters — version=1.3, pattern=07135890</w:t>
-        <w:br/>
-      </w:r>
-    </w:p>
-    <w:p>
-      <w:r>
-        <w:rPr>
-          <w:sz w:val="22"/>
-        </w:rPr>
-        <w:t>• WorkWithPlusPromptGeolocation — version=1.3, pattern=07135890</w:t>
-        <w:br/>
-      </w:r>
-    </w:p>
-    <w:p>
-      <w:r>
-        <w:rPr>
-          <w:sz w:val="22"/>
-        </w:rPr>
-        <w:t>• WorkWithPlusSaveFilterAs — version=1.3, pattern=07135890</w:t>
-        <w:br/>
-      </w:r>
-    </w:p>
-    <w:p>
-      <w:r>
-        <w:rPr>
-          <w:sz w:val="22"/>
-        </w:rPr>
-        <w:t>• WorkWithPlusWizardStepsArrowWC — version=1.3, pattern=07135890</w:t>
-        <w:br/>
-      </w:r>
-    </w:p>
-    <w:p>
-      <w:r>
-        <w:rPr>
-          <w:sz w:val="22"/>
-        </w:rPr>
-        <w:t>• WorkWithPlusWizardStepsBulletWC — version=1.3, pattern=07135890</w:t>
-        <w:br/>
-      </w:r>
-    </w:p>
-    <w:p>
-      <w:r>
-        <w:rPr>
-          <w:sz w:val="22"/>
-        </w:rPr>
-        <w:t>• WorkWithPlusNotAuthorized — version=1.3, pattern=07135890</w:t>
-        <w:br/>
-      </w:r>
-    </w:p>
-    <w:p>
-      <w:r>
-        <w:rPr>
-          <w:sz w:val="22"/>
-        </w:rPr>
-        <w:t>• WorkWithPlusHomeProgressBarCircleWC — version=1.3, pattern=07135890</w:t>
-        <w:br/>
-      </w:r>
-    </w:p>
-    <w:p>
-      <w:r>
-        <w:rPr>
-          <w:sz w:val="22"/>
-        </w:rPr>
-        <w:t>• WorkWithPlusWCPB — version=1.3, pattern=07135890</w:t>
-        <w:br/>
-      </w:r>
-    </w:p>
-    <w:p>
-      <w:r>
-        <w:rPr>
-          <w:sz w:val="22"/>
-        </w:rPr>
-        <w:t>• WorkWithPlusExportReportTemplate_Style1 — version=1.3, pattern=07135890</w:t>
-        <w:br/>
-      </w:r>
-    </w:p>
-    <w:p>
-      <w:r>
-        <w:rPr>
-          <w:sz w:val="22"/>
-        </w:rPr>
-        <w:t>• WorkWithPlusExportReportTemplate_Style2 — version=1.3, pattern=07135890</w:t>
-        <w:br/>
-      </w:r>
-    </w:p>
-    <w:p>
-      <w:r>
-        <w:rPr>
-          <w:sz w:val="22"/>
-        </w:rPr>
-        <w:t>• WorkWithPlusExportReportTemplate_Style3 — version=1.3, pattern=07135890</w:t>
-        <w:br/>
-      </w:r>
-    </w:p>
-    <w:p>
-      <w:r>
-        <w:rPr>
-          <w:sz w:val="22"/>
-        </w:rPr>
-        <w:t>• WorkWithPlusMasterPageFrame — version=1.3, pattern=07135890</w:t>
-        <w:br/>
-      </w:r>
-    </w:p>
-    <w:p>
-      <w:r>
-        <w:rPr>
-          <w:sz w:val="22"/>
-        </w:rPr>
-        <w:t>• WorkWithPlusWorkWithPlusMasterPagePrompt — version=1.3, pattern=07135890</w:t>
-        <w:br/>
-      </w:r>
-    </w:p>
-    <w:p>
-      <w:r>
-        <w:rPr>
-          <w:sz w:val="22"/>
-        </w:rPr>
-        <w:t>• WorkWithPlusEmpresa — version=1.3, pattern=07135890</w:t>
-        <w:br/>
-      </w:r>
-    </w:p>
-    <w:p>
-      <w:r>
-        <w:rPr>
-          <w:sz w:val="22"/>
-        </w:rPr>
-        <w:t>• WorkWithPlusUsuario — version=1.3, pattern=07135890</w:t>
-        <w:br/>
-      </w:r>
-    </w:p>
-    <w:p>
-      <w:r>
-        <w:rPr>
-          <w:sz w:val="22"/>
-        </w:rPr>
-        <w:t>• WorkWithPlusCliente — version=1.3, pattern=07135890</w:t>
-        <w:br/>
-      </w:r>
-    </w:p>
-    <w:p>
-      <w:r>
-        <w:rPr>
-          <w:sz w:val="22"/>
-        </w:rPr>
-        <w:t>• WorkWithPlusSetor — version=1.3, pattern=07135890</w:t>
-        <w:br/>
-      </w:r>
-    </w:p>
-    <w:p>
-      <w:r>
-        <w:rPr>
-          <w:sz w:val="22"/>
-        </w:rPr>
-        <w:t>• WorkWithPlusNatureza — version=1.3, pattern=07135890</w:t>
-        <w:br/>
-      </w:r>
-    </w:p>
-    <w:p>
-      <w:r>
-        <w:rPr>
-          <w:sz w:val="22"/>
-        </w:rPr>
-        <w:t>• WorkWithPlusWorkWithPlusMasterPage — version=1.3, pattern=07135890</w:t>
-        <w:br/>
-      </w:r>
-    </w:p>
-    <w:p>
-      <w:r>
-        <w:rPr>
-          <w:sz w:val="22"/>
-        </w:rPr>
-        <w:t>• WorkWithPlusGestaoServico — version=1.3, pattern=07135890</w:t>
-        <w:br/>
-      </w:r>
-    </w:p>
-    <w:p>
-      <w:r>
-        <w:rPr>
-          <w:sz w:val="22"/>
-        </w:rPr>
-        <w:t>• WorkWithPlusParametro — version=1.3, pattern=07135890</w:t>
-        <w:br/>
-      </w:r>
-    </w:p>
-    <w:p>
-      <w:r>
-        <w:rPr>
-          <w:sz w:val="22"/>
-        </w:rPr>
-        <w:t>• WorkWithPlusParametroEmail — version=1.3, pattern=07135890</w:t>
-        <w:br/>
-      </w:r>
-    </w:p>
-    <w:p>
-      <w:r>
-        <w:rPr>
-          <w:sz w:val="22"/>
-        </w:rPr>
-        <w:t>• WorkWithPlusWPUsuario — version=1.3, pattern=07135890</w:t>
-        <w:br/>
-      </w:r>
-    </w:p>
-    <w:p>
-      <w:r>
-        <w:rPr>
-          <w:sz w:val="22"/>
-        </w:rPr>
-        <w:t>• WorkWithPlusWPRelatorioOrdem — version=1.3, pattern=07135890</w:t>
-        <w:br/>
-      </w:r>
-    </w:p>
-    <w:p>
-      <w:r>
-        <w:rPr>
-          <w:sz w:val="22"/>
-        </w:rPr>
-        <w:t>• WorkWithPlusDashboardServico — version=1.3, pattern=07135890</w:t>
-        <w:br/>
-      </w:r>
-    </w:p>
-    <w:p>
-      <w:r>
-        <w:rPr>
-          <w:sz w:val="22"/>
-        </w:rPr>
-        <w:t>• WorkWithPlusEditBookmark — version=1.3, pattern=07135890</w:t>
-        <w:br/>
-      </w:r>
-    </w:p>
-    <w:p>
-      <w:r>
-        <w:rPr>
-          <w:sz w:val="22"/>
-        </w:rPr>
-        <w:t>• WorkWithPlusWPExecutarAtendimento — version=1.3, pattern=07135890</w:t>
-        <w:br/>
-      </w:r>
-    </w:p>
-    <w:p>
-      <w:r>
-        <w:rPr>
-          <w:sz w:val="22"/>
-        </w:rPr>
-        <w:t>• WorkWithPlusNotificacao — version=1.3, pattern=07135890</w:t>
-        <w:br/>
-      </w:r>
-    </w:p>
-    <w:p>
-      <w:r>
-        <w:rPr>
-          <w:sz w:val="22"/>
-        </w:rPr>
-        <w:t>• WorkWithPlusFavorito — version=1.3, pattern=07135890</w:t>
-        <w:br/>
-      </w:r>
-    </w:p>
-    <w:p>
-      <w:r>
-        <w:rPr>
-          <w:sz w:val="22"/>
-        </w:rPr>
-        <w:t>• WorkWithPlusWPContato — version=1.3, pattern=07135890</w:t>
-        <w:br/>
-      </w:r>
-    </w:p>
-    <w:p>
-      <w:r>
-        <w:rPr>
-          <w:sz w:val="22"/>
-        </w:rPr>
-        <w:t>• WorkWithPlusWPGestaoServico — version=1.3, pattern=07135890</w:t>
-        <w:br/>
-      </w:r>
-    </w:p>
-    <w:p>
-      <w:r>
-        <w:rPr>
-          <w:sz w:val="22"/>
-        </w:rPr>
-        <w:t>• WorkWithPlusWPProgramarAtendimento — version=1.3, pattern=07135890</w:t>
-        <w:br/>
-      </w:r>
-    </w:p>
-    <w:p>
-      <w:r>
-        <w:rPr>
-          <w:sz w:val="22"/>
-        </w:rPr>
-        <w:t>• WorkWithPlusWPRelatorioTimeSheet — version=1.3, pattern=07135890</w:t>
-        <w:br/>
-      </w:r>
-    </w:p>
-    <w:p>
-      <w:r>
-        <w:rPr>
-          <w:sz w:val="22"/>
-        </w:rPr>
-        <w:t>• WorkWithPlusWPTipoServicoAtividades — version=1.3, pattern=07135890</w:t>
-        <w:br/>
-      </w:r>
-    </w:p>
-    <w:p>
-      <w:r>
-        <w:rPr>
-          <w:sz w:val="22"/>
-        </w:rPr>
-        <w:t>• WorkWithPlusWPWizardNovaOS — version=1.3, pattern=07135890</w:t>
-        <w:br/>
-      </w:r>
-    </w:p>
-    <w:p>
-      <w:r>
-        <w:rPr>
-          <w:sz w:val="22"/>
-        </w:rPr>
-        <w:t>• WorkWithPlusWPQualificarOS — version=1.3, pattern=07135890</w:t>
+        <w:t>• WorkWithPlusAcessoCliente — pattern=07135890, version=1.3</w:t>
+        <w:br/>
+      </w:r>
+    </w:p>
+    <w:p>
+      <w:r>
+        <w:rPr>
+          <w:sz w:val="22"/>
+        </w:rPr>
+        <w:t>• WorkWithPlusAddressDisplay — pattern=07135890, version=1.3</w:t>
+        <w:br/>
+      </w:r>
+    </w:p>
+    <w:p>
+      <w:r>
+        <w:rPr>
+          <w:sz w:val="22"/>
+        </w:rPr>
+        <w:t>• WorkWithPlusExportOptions — pattern=07135890, version=1.3</w:t>
+        <w:br/>
+      </w:r>
+    </w:p>
+    <w:p>
+      <w:r>
+        <w:rPr>
+          <w:sz w:val="22"/>
+        </w:rPr>
+        <w:t>• WorkWithPlusHome — pattern=07135890, version=1.3</w:t>
+        <w:br/>
+      </w:r>
+    </w:p>
+    <w:p>
+      <w:r>
+        <w:rPr>
+          <w:sz w:val="22"/>
+        </w:rPr>
+        <w:t>• WorkWithPlusManageFilters — pattern=07135890, version=1.3</w:t>
+        <w:br/>
+      </w:r>
+    </w:p>
+    <w:p>
+      <w:r>
+        <w:rPr>
+          <w:sz w:val="22"/>
+        </w:rPr>
+        <w:t>• WorkWithPlusPromptGeolocation — pattern=07135890, version=1.3</w:t>
+        <w:br/>
+      </w:r>
+    </w:p>
+    <w:p>
+      <w:r>
+        <w:rPr>
+          <w:sz w:val="22"/>
+        </w:rPr>
+        <w:t>• WorkWithPlusSaveFilterAs — pattern=07135890, version=1.3</w:t>
+        <w:br/>
+      </w:r>
+    </w:p>
+    <w:p>
+      <w:r>
+        <w:rPr>
+          <w:sz w:val="22"/>
+        </w:rPr>
+        <w:t>• WorkWithPlusWizardStepsArrowWC — pattern=07135890, version=1.3</w:t>
+        <w:br/>
+      </w:r>
+    </w:p>
+    <w:p>
+      <w:r>
+        <w:rPr>
+          <w:sz w:val="22"/>
+        </w:rPr>
+        <w:t>• WorkWithPlusWizardStepsBulletWC — pattern=07135890, version=1.3</w:t>
+        <w:br/>
+      </w:r>
+    </w:p>
+    <w:p>
+      <w:r>
+        <w:rPr>
+          <w:sz w:val="22"/>
+        </w:rPr>
+        <w:t>• WorkWithPlusNotAuthorized — pattern=07135890, version=1.3</w:t>
+        <w:br/>
+      </w:r>
+    </w:p>
+    <w:p>
+      <w:r>
+        <w:rPr>
+          <w:sz w:val="22"/>
+        </w:rPr>
+        <w:t>• WorkWithPlusHomeProgressBarCircleWC — pattern=07135890, version=1.3</w:t>
+        <w:br/>
+      </w:r>
+    </w:p>
+    <w:p>
+      <w:r>
+        <w:rPr>
+          <w:sz w:val="22"/>
+        </w:rPr>
+        <w:t>• WorkWithPlusWCPB — pattern=07135890, version=1.3</w:t>
+        <w:br/>
+      </w:r>
+    </w:p>
+    <w:p>
+      <w:r>
+        <w:rPr>
+          <w:sz w:val="22"/>
+        </w:rPr>
+        <w:t>• WorkWithPlusExportReportTemplate_Style1 — pattern=07135890, version=1.3</w:t>
+        <w:br/>
+      </w:r>
+    </w:p>
+    <w:p>
+      <w:r>
+        <w:rPr>
+          <w:sz w:val="22"/>
+        </w:rPr>
+        <w:t>• WorkWithPlusExportReportTemplate_Style2 — pattern=07135890, version=1.3</w:t>
+        <w:br/>
+      </w:r>
+    </w:p>
+    <w:p>
+      <w:r>
+        <w:rPr>
+          <w:sz w:val="22"/>
+        </w:rPr>
+        <w:t>• WorkWithPlusExportReportTemplate_Style3 — pattern=07135890, version=1.3</w:t>
+        <w:br/>
+      </w:r>
+    </w:p>
+    <w:p>
+      <w:r>
+        <w:rPr>
+          <w:sz w:val="22"/>
+        </w:rPr>
+        <w:t>• WorkWithPlusMasterPageFrame — pattern=07135890, version=1.3</w:t>
+        <w:br/>
+      </w:r>
+    </w:p>
+    <w:p>
+      <w:r>
+        <w:rPr>
+          <w:sz w:val="22"/>
+        </w:rPr>
+        <w:t>• WorkWithPlusWorkWithPlusMasterPagePrompt — pattern=07135890, version=1.3</w:t>
+        <w:br/>
+      </w:r>
+    </w:p>
+    <w:p>
+      <w:r>
+        <w:rPr>
+          <w:sz w:val="22"/>
+        </w:rPr>
+        <w:t>• WorkWithPlusEmpresa — pattern=07135890, version=1.3</w:t>
+        <w:br/>
+      </w:r>
+    </w:p>
+    <w:p>
+      <w:r>
+        <w:rPr>
+          <w:sz w:val="22"/>
+        </w:rPr>
+        <w:t>• WorkWithPlusUsuario — pattern=07135890, version=1.3</w:t>
+        <w:br/>
+      </w:r>
+    </w:p>
+    <w:p>
+      <w:r>
+        <w:rPr>
+          <w:sz w:val="22"/>
+        </w:rPr>
+        <w:t>• WorkWithPlusCliente — pattern=07135890, version=1.3</w:t>
+        <w:br/>
+      </w:r>
+    </w:p>
+    <w:p>
+      <w:r>
+        <w:rPr>
+          <w:sz w:val="22"/>
+        </w:rPr>
+        <w:t>• WorkWithPlusSetor — pattern=07135890, version=1.3</w:t>
+        <w:br/>
+      </w:r>
+    </w:p>
+    <w:p>
+      <w:r>
+        <w:rPr>
+          <w:sz w:val="22"/>
+        </w:rPr>
+        <w:t>• WorkWithPlusNatureza — pattern=07135890, version=1.3</w:t>
+        <w:br/>
+      </w:r>
+    </w:p>
+    <w:p>
+      <w:r>
+        <w:rPr>
+          <w:sz w:val="22"/>
+        </w:rPr>
+        <w:t>• WorkWithPlusWorkWithPlusMasterPage — pattern=07135890, version=1.3</w:t>
+        <w:br/>
+      </w:r>
+    </w:p>
+    <w:p>
+      <w:r>
+        <w:rPr>
+          <w:sz w:val="22"/>
+        </w:rPr>
+        <w:t>• WorkWithPlusGestaoServico — pattern=07135890, version=1.3</w:t>
+        <w:br/>
+      </w:r>
+    </w:p>
+    <w:p>
+      <w:r>
+        <w:rPr>
+          <w:sz w:val="22"/>
+        </w:rPr>
+        <w:t>• WorkWithPlusParametro — pattern=07135890, version=1.3</w:t>
+        <w:br/>
+      </w:r>
+    </w:p>
+    <w:p>
+      <w:r>
+        <w:rPr>
+          <w:sz w:val="22"/>
+        </w:rPr>
+        <w:t>• WorkWithPlusParametroEmail — pattern=07135890, version=1.3</w:t>
+        <w:br/>
+      </w:r>
+    </w:p>
+    <w:p>
+      <w:r>
+        <w:rPr>
+          <w:sz w:val="22"/>
+        </w:rPr>
+        <w:t>• WorkWithPlusWPUsuario — pattern=07135890, version=1.3</w:t>
+        <w:br/>
+      </w:r>
+    </w:p>
+    <w:p>
+      <w:r>
+        <w:rPr>
+          <w:sz w:val="22"/>
+        </w:rPr>
+        <w:t>• WorkWithPlusWPRelatorioOrdem — pattern=07135890, version=1.3</w:t>
+        <w:br/>
+      </w:r>
+    </w:p>
+    <w:p>
+      <w:r>
+        <w:rPr>
+          <w:sz w:val="22"/>
+        </w:rPr>
+        <w:t>• WorkWithPlusDashboardServico — pattern=07135890, version=1.3</w:t>
+        <w:br/>
+      </w:r>
+    </w:p>
+    <w:p>
+      <w:r>
+        <w:rPr>
+          <w:sz w:val="22"/>
+        </w:rPr>
+        <w:t>• WorkWithPlusEditBookmark — pattern=07135890, version=1.3</w:t>
+        <w:br/>
+      </w:r>
+    </w:p>
+    <w:p>
+      <w:r>
+        <w:rPr>
+          <w:sz w:val="22"/>
+        </w:rPr>
+        <w:t>• WorkWithPlusWPExecutarAtendimento — pattern=07135890, version=1.3</w:t>
+        <w:br/>
+      </w:r>
+    </w:p>
+    <w:p>
+      <w:r>
+        <w:rPr>
+          <w:sz w:val="22"/>
+        </w:rPr>
+        <w:t>• WorkWithPlusNotificacao — pattern=07135890, version=1.3</w:t>
+        <w:br/>
+      </w:r>
+    </w:p>
+    <w:p>
+      <w:r>
+        <w:rPr>
+          <w:sz w:val="22"/>
+        </w:rPr>
+        <w:t>• WorkWithPlusFavorito — pattern=07135890, version=1.3</w:t>
+        <w:br/>
+      </w:r>
+    </w:p>
+    <w:p>
+      <w:r>
+        <w:rPr>
+          <w:sz w:val="22"/>
+        </w:rPr>
+        <w:t>• WorkWithPlusWPContato — pattern=07135890, version=1.3</w:t>
+        <w:br/>
+      </w:r>
+    </w:p>
+    <w:p>
+      <w:r>
+        <w:rPr>
+          <w:sz w:val="22"/>
+        </w:rPr>
+        <w:t>• WorkWithPlusWPGestaoServico — pattern=07135890, version=1.3</w:t>
+        <w:br/>
+      </w:r>
+    </w:p>
+    <w:p>
+      <w:r>
+        <w:rPr>
+          <w:sz w:val="22"/>
+        </w:rPr>
+        <w:t>• WorkWithPlusWPProgramarAtendimento — pattern=07135890, version=1.3</w:t>
+        <w:br/>
+      </w:r>
+    </w:p>
+    <w:p>
+      <w:r>
+        <w:rPr>
+          <w:sz w:val="22"/>
+        </w:rPr>
+        <w:t>• WorkWithPlusWPRelatorioTimeSheet — pattern=07135890, version=1.3</w:t>
+        <w:br/>
+      </w:r>
+    </w:p>
+    <w:p>
+      <w:r>
+        <w:rPr>
+          <w:sz w:val="22"/>
+        </w:rPr>
+        <w:t>• WorkWithPlusWPTipoServicoAtividades — pattern=07135890, version=1.3</w:t>
+        <w:br/>
+      </w:r>
+    </w:p>
+    <w:p>
+      <w:r>
+        <w:rPr>
+          <w:sz w:val="22"/>
+        </w:rPr>
+        <w:t>• WorkWithPlusWPWizardNovaOS — pattern=07135890, version=1.3</w:t>
+        <w:br/>
+      </w:r>
+    </w:p>
+    <w:p>
+      <w:r>
+        <w:rPr>
+          <w:sz w:val="22"/>
+        </w:rPr>
+        <w:t>• WorkWithPlusWPQualificarOS — pattern=07135890, version=1.3</w:t>
         <w:br/>
       </w:r>
     </w:p>

</xml_diff>